<commit_message>
docs: regenerate Word document
</commit_message>
<xml_diff>
--- a/dev-notes.docx
+++ b/dev-notes.docx
@@ -1361,6 +1361,14 @@
         <w:t>Jour 2 : Installation des Dépendances</w:t>
       </w:r>
     </w:p>
+    <w:p>
+      <w:pPr>
+        <w:pStyle w:val="IntenseQuote"/>
+      </w:pPr>
+      <w:r>
+        <w:t>Note : Ces packages correspondent au programme O'clock</w:t>
+      </w:r>
+    </w:p>
     <w:tbl>
       <w:tblPr>
         <w:tblStyle w:val="TableGrid"/>
@@ -1571,27 +1579,27 @@
           </w:tcPr>
           <w:p>
             <w:r>
-              <w:t>Installer bcrypt</w:t>
-            </w:r>
-          </w:p>
-        </w:tc>
-        <w:tc>
-          <w:tcPr>
-            <w:tcW w:type="dxa" w:w="2160"/>
-          </w:tcPr>
-          <w:p>
-            <w:r>
-              <w:t>`npm i bcrypt`</w:t>
-            </w:r>
-          </w:p>
-        </w:tc>
-        <w:tc>
-          <w:tcPr>
-            <w:tcW w:type="dxa" w:w="2160"/>
-          </w:tcPr>
-          <w:p>
-            <w:r>
-              <w:t>Hachage mots de passe</w:t>
+              <w:t>Installer argon2</w:t>
+            </w:r>
+          </w:p>
+        </w:tc>
+        <w:tc>
+          <w:tcPr>
+            <w:tcW w:type="dxa" w:w="2160"/>
+          </w:tcPr>
+          <w:p>
+            <w:r>
+              <w:t>`npm i argon2`</w:t>
+            </w:r>
+          </w:p>
+        </w:tc>
+        <w:tc>
+          <w:tcPr>
+            <w:tcW w:type="dxa" w:w="2160"/>
+          </w:tcPr>
+          <w:p>
+            <w:r>
+              <w:t>Hachage mots de passe (plus sécurisé que bcrypt)</w:t>
             </w:r>
           </w:p>
         </w:tc>
@@ -1613,27 +1621,27 @@
           </w:tcPr>
           <w:p>
             <w:r>
-              <w:t>Installer express-session</w:t>
-            </w:r>
-          </w:p>
-        </w:tc>
-        <w:tc>
-          <w:tcPr>
-            <w:tcW w:type="dxa" w:w="2160"/>
-          </w:tcPr>
-          <w:p>
-            <w:r>
-              <w:t>`npm i express-session`</w:t>
-            </w:r>
-          </w:p>
-        </w:tc>
-        <w:tc>
-          <w:tcPr>
-            <w:tcW w:type="dxa" w:w="2160"/>
-          </w:tcPr>
-          <w:p>
-            <w:r>
-              <w:t>Gestion des sessions</w:t>
+              <w:t>Installer bcrypt (backup)</w:t>
+            </w:r>
+          </w:p>
+        </w:tc>
+        <w:tc>
+          <w:tcPr>
+            <w:tcW w:type="dxa" w:w="2160"/>
+          </w:tcPr>
+          <w:p>
+            <w:r>
+              <w:t>`npm i bcrypt`</w:t>
+            </w:r>
+          </w:p>
+        </w:tc>
+        <w:tc>
+          <w:tcPr>
+            <w:tcW w:type="dxa" w:w="2160"/>
+          </w:tcPr>
+          <w:p>
+            <w:r>
+              <w:t>Alternative si argon2 pose problème</w:t>
             </w:r>
           </w:p>
         </w:tc>
@@ -1655,27 +1663,27 @@
           </w:tcPr>
           <w:p>
             <w:r>
-              <w:t>Installer helmet</w:t>
-            </w:r>
-          </w:p>
-        </w:tc>
-        <w:tc>
-          <w:tcPr>
-            <w:tcW w:type="dxa" w:w="2160"/>
-          </w:tcPr>
-          <w:p>
-            <w:r>
-              <w:t>`npm i helmet`</w:t>
-            </w:r>
-          </w:p>
-        </w:tc>
-        <w:tc>
-          <w:tcPr>
-            <w:tcW w:type="dxa" w:w="2160"/>
-          </w:tcPr>
-          <w:p>
-            <w:r>
-              <w:t>Headers de sécurité</w:t>
+              <w:t>Installer express-session</w:t>
+            </w:r>
+          </w:p>
+        </w:tc>
+        <w:tc>
+          <w:tcPr>
+            <w:tcW w:type="dxa" w:w="2160"/>
+          </w:tcPr>
+          <w:p>
+            <w:r>
+              <w:t>`npm i express-session`</w:t>
+            </w:r>
+          </w:p>
+        </w:tc>
+        <w:tc>
+          <w:tcPr>
+            <w:tcW w:type="dxa" w:w="2160"/>
+          </w:tcPr>
+          <w:p>
+            <w:r>
+              <w:t>Gestion des sessions</w:t>
             </w:r>
           </w:p>
         </w:tc>
@@ -1697,27 +1705,27 @@
           </w:tcPr>
           <w:p>
             <w:r>
-              <w:t>Installer cors</w:t>
-            </w:r>
-          </w:p>
-        </w:tc>
-        <w:tc>
-          <w:tcPr>
-            <w:tcW w:type="dxa" w:w="2160"/>
-          </w:tcPr>
-          <w:p>
-            <w:r>
-              <w:t>`npm i cors`</w:t>
-            </w:r>
-          </w:p>
-        </w:tc>
-        <w:tc>
-          <w:tcPr>
-            <w:tcW w:type="dxa" w:w="2160"/>
-          </w:tcPr>
-          <w:p>
-            <w:r>
-              <w:t>Cross-Origin Requests</w:t>
+              <w:t>Installer dotenv</w:t>
+            </w:r>
+          </w:p>
+        </w:tc>
+        <w:tc>
+          <w:tcPr>
+            <w:tcW w:type="dxa" w:w="2160"/>
+          </w:tcPr>
+          <w:p>
+            <w:r>
+              <w:t>`npm i dotenv`</w:t>
+            </w:r>
+          </w:p>
+        </w:tc>
+        <w:tc>
+          <w:tcPr>
+            <w:tcW w:type="dxa" w:w="2160"/>
+          </w:tcPr>
+          <w:p>
+            <w:r>
+              <w:t>Variables d'environnement</w:t>
             </w:r>
           </w:p>
         </w:tc>
@@ -1739,27 +1747,27 @@
           </w:tcPr>
           <w:p>
             <w:r>
-              <w:t>Installer dotenv</w:t>
-            </w:r>
-          </w:p>
-        </w:tc>
-        <w:tc>
-          <w:tcPr>
-            <w:tcW w:type="dxa" w:w="2160"/>
-          </w:tcPr>
-          <w:p>
-            <w:r>
-              <w:t>`npm i dotenv`</w:t>
-            </w:r>
-          </w:p>
-        </w:tc>
-        <w:tc>
-          <w:tcPr>
-            <w:tcW w:type="dxa" w:w="2160"/>
-          </w:tcPr>
-          <w:p>
-            <w:r>
-              <w:t>Variables d'environnement</w:t>
+              <w:t>Installer express-validator</w:t>
+            </w:r>
+          </w:p>
+        </w:tc>
+        <w:tc>
+          <w:tcPr>
+            <w:tcW w:type="dxa" w:w="2160"/>
+          </w:tcPr>
+          <w:p>
+            <w:r>
+              <w:t>`npm i express-validator`</w:t>
+            </w:r>
+          </w:p>
+        </w:tc>
+        <w:tc>
+          <w:tcPr>
+            <w:tcW w:type="dxa" w:w="2160"/>
+          </w:tcPr>
+          <w:p>
+            <w:r>
+              <w:t>Validation des entrées</w:t>
             </w:r>
           </w:p>
         </w:tc>
@@ -1781,27 +1789,27 @@
           </w:tcPr>
           <w:p>
             <w:r>
-              <w:t>Installer multer</w:t>
-            </w:r>
-          </w:p>
-        </w:tc>
-        <w:tc>
-          <w:tcPr>
-            <w:tcW w:type="dxa" w:w="2160"/>
-          </w:tcPr>
-          <w:p>
-            <w:r>
-              <w:t>`npm i multer`</w:t>
-            </w:r>
-          </w:p>
-        </w:tc>
-        <w:tc>
-          <w:tcPr>
-            <w:tcW w:type="dxa" w:w="2160"/>
-          </w:tcPr>
-          <w:p>
-            <w:r>
-              <w:t>Upload de fichiers (images)</w:t>
+              <w:t>Installer joi</w:t>
+            </w:r>
+          </w:p>
+        </w:tc>
+        <w:tc>
+          <w:tcPr>
+            <w:tcW w:type="dxa" w:w="2160"/>
+          </w:tcPr>
+          <w:p>
+            <w:r>
+              <w:t>`npm i joi`</w:t>
+            </w:r>
+          </w:p>
+        </w:tc>
+        <w:tc>
+          <w:tcPr>
+            <w:tcW w:type="dxa" w:w="2160"/>
+          </w:tcPr>
+          <w:p>
+            <w:r>
+              <w:t>Validation de schémas (alternative)</w:t>
             </w:r>
           </w:p>
         </w:tc>
@@ -1823,27 +1831,27 @@
           </w:tcPr>
           <w:p>
             <w:r>
-              <w:t>Installer express-validator</w:t>
-            </w:r>
-          </w:p>
-        </w:tc>
-        <w:tc>
-          <w:tcPr>
-            <w:tcW w:type="dxa" w:w="2160"/>
-          </w:tcPr>
-          <w:p>
-            <w:r>
-              <w:t>`npm i express-validator`</w:t>
-            </w:r>
-          </w:p>
-        </w:tc>
-        <w:tc>
-          <w:tcPr>
-            <w:tcW w:type="dxa" w:w="2160"/>
-          </w:tcPr>
-          <w:p>
-            <w:r>
-              <w:t>Validation des entrées</w:t>
+              <w:t>Installer cors</w:t>
+            </w:r>
+          </w:p>
+        </w:tc>
+        <w:tc>
+          <w:tcPr>
+            <w:tcW w:type="dxa" w:w="2160"/>
+          </w:tcPr>
+          <w:p>
+            <w:r>
+              <w:t>`npm i cors`</w:t>
+            </w:r>
+          </w:p>
+        </w:tc>
+        <w:tc>
+          <w:tcPr>
+            <w:tcW w:type="dxa" w:w="2160"/>
+          </w:tcPr>
+          <w:p>
+            <w:r>
+              <w:t>Cross-Origin Requests</w:t>
             </w:r>
           </w:p>
         </w:tc>
@@ -1931,6 +1939,11 @@
         </w:tc>
       </w:tr>
     </w:tbl>
+    <w:p>
+      <w:r>
+        <w:t>Note sur les images : Pour le MVP, les recettes utiliseront des URLs d'images (texte) au lieu d'uploads. Cela évite d'utiliser multer et simplifie le projet.</w:t>
+      </w:r>
+    </w:p>
     <w:p>
       <w:pPr>
         <w:pStyle w:val="Heading3"/>
@@ -5964,27 +5977,27 @@
           </w:tcPr>
           <w:p>
             <w:r>
-              <w:t>Gérer upload image</w:t>
-            </w:r>
-          </w:p>
-        </w:tc>
-        <w:tc>
-          <w:tcPr>
-            <w:tcW w:type="dxa" w:w="2160"/>
-          </w:tcPr>
-          <w:p>
-            <w:r>
-              <w:t>Multer config</w:t>
-            </w:r>
-          </w:p>
-        </w:tc>
-        <w:tc>
-          <w:tcPr>
-            <w:tcW w:type="dxa" w:w="2160"/>
-          </w:tcPr>
-          <w:p>
-            <w:r>
-              <w:t>Stockage local ou cloud</w:t>
+              <w:t>Ajouter champ URL image</w:t>
+            </w:r>
+          </w:p>
+        </w:tc>
+        <w:tc>
+          <w:tcPr>
+            <w:tcW w:type="dxa" w:w="2160"/>
+          </w:tcPr>
+          <w:p>
+            <w:r>
+              <w:t>`recipe-form.ejs`</w:t>
+            </w:r>
+          </w:p>
+        </w:tc>
+        <w:tc>
+          <w:tcPr>
+            <w:tcW w:type="dxa" w:w="2160"/>
+          </w:tcPr>
+          <w:p>
+            <w:r>
+              <w:t>Champ texte pour URL (pas d'upload fichier)</w:t>
             </w:r>
           </w:p>
         </w:tc>
@@ -7396,456 +7409,36 @@
         <w:t>Semaine 3 - Jour 3 : Sécurité &amp; Performance</w:t>
       </w:r>
     </w:p>
-    <w:tbl>
-      <w:tblPr>
-        <w:tblStyle w:val="TableGrid"/>
-        <w:tblW w:type="auto" w:w="0"/>
-        <w:jc w:val="center"/>
-        <w:tblLook w:firstColumn="1" w:firstRow="1" w:lastColumn="0" w:lastRow="0" w:noHBand="0" w:noVBand="1" w:val="04A0"/>
-      </w:tblPr>
-      <w:tblGrid>
-        <w:gridCol w:w="2160"/>
-        <w:gridCol w:w="2160"/>
-        <w:gridCol w:w="2160"/>
-        <w:gridCol w:w="2160"/>
-      </w:tblGrid>
-      <w:tr>
-        <w:tc>
-          <w:tcPr>
-            <w:tcW w:type="dxa" w:w="2160"/>
-          </w:tcPr>
-          <w:p>
-            <w:r>
-              <w:rPr>
-                <w:b/>
-              </w:rPr>
-              <w:t>#</w:t>
-            </w:r>
-          </w:p>
-        </w:tc>
-        <w:tc>
-          <w:tcPr>
-            <w:tcW w:type="dxa" w:w="2160"/>
-          </w:tcPr>
-          <w:p>
-            <w:r>
-              <w:rPr>
-                <w:b/>
-              </w:rPr>
-              <w:t>Tâche</w:t>
-            </w:r>
-          </w:p>
-        </w:tc>
-        <w:tc>
-          <w:tcPr>
-            <w:tcW w:type="dxa" w:w="2160"/>
-          </w:tcPr>
-          <w:p>
-            <w:r>
-              <w:rPr>
-                <w:b/>
-              </w:rPr>
-              <w:t>Fichier</w:t>
-            </w:r>
-          </w:p>
-        </w:tc>
-        <w:tc>
-          <w:tcPr>
-            <w:tcW w:type="dxa" w:w="2160"/>
-          </w:tcPr>
-          <w:p>
-            <w:r>
-              <w:rPr>
-                <w:b/>
-              </w:rPr>
-              <w:t>Description</w:t>
-            </w:r>
-          </w:p>
-        </w:tc>
-      </w:tr>
-      <w:tr>
-        <w:tc>
-          <w:tcPr>
-            <w:tcW w:type="dxa" w:w="2160"/>
-          </w:tcPr>
-          <w:p>
-            <w:r>
-              <w:t>3.9</w:t>
-            </w:r>
-          </w:p>
-        </w:tc>
-        <w:tc>
-          <w:tcPr>
-            <w:tcW w:type="dxa" w:w="2160"/>
-          </w:tcPr>
-          <w:p>
-            <w:r>
-              <w:t>Audit sécurité dépendances</w:t>
-            </w:r>
-          </w:p>
-        </w:tc>
-        <w:tc>
-          <w:tcPr>
-            <w:tcW w:type="dxa" w:w="2160"/>
-          </w:tcPr>
-          <w:p>
-            <w:r>
-              <w:t>`npm audit`</w:t>
-            </w:r>
-          </w:p>
-        </w:tc>
-        <w:tc>
-          <w:tcPr>
-            <w:tcW w:type="dxa" w:w="2160"/>
-          </w:tcPr>
-          <w:p>
-            <w:r>
-              <w:t>Corriger vulnérabilités</w:t>
-            </w:r>
-          </w:p>
-        </w:tc>
-      </w:tr>
-      <w:tr>
-        <w:tc>
-          <w:tcPr>
-            <w:tcW w:type="dxa" w:w="2160"/>
-          </w:tcPr>
-          <w:p>
-            <w:r>
-              <w:t>3.10</w:t>
-            </w:r>
-          </w:p>
-        </w:tc>
-        <w:tc>
-          <w:tcPr>
-            <w:tcW w:type="dxa" w:w="2160"/>
-          </w:tcPr>
-          <w:p>
-            <w:r>
-              <w:t>Implémenter rate limiting</w:t>
-            </w:r>
-          </w:p>
-        </w:tc>
-        <w:tc>
-          <w:tcPr>
-            <w:tcW w:type="dxa" w:w="2160"/>
-          </w:tcPr>
-          <w:p>
-            <w:r>
-              <w:t>`express-rate-limit`</w:t>
-            </w:r>
-          </w:p>
-        </w:tc>
-        <w:tc>
-          <w:tcPr>
-            <w:tcW w:type="dxa" w:w="2160"/>
-          </w:tcPr>
-          <w:p>
-            <w:r>
-              <w:t>100 requests/15min</w:t>
-            </w:r>
-          </w:p>
-        </w:tc>
-      </w:tr>
-      <w:tr>
-        <w:tc>
-          <w:tcPr>
-            <w:tcW w:type="dxa" w:w="2160"/>
-          </w:tcPr>
-          <w:p>
-            <w:r>
-              <w:t>3.11</w:t>
-            </w:r>
-          </w:p>
-        </w:tc>
-        <w:tc>
-          <w:tcPr>
-            <w:tcW w:type="dxa" w:w="2160"/>
-          </w:tcPr>
-          <w:p>
-            <w:r>
-              <w:t>Vérifier tokens CSRF</w:t>
-            </w:r>
-          </w:p>
-        </w:tc>
-        <w:tc>
-          <w:tcPr>
-            <w:tcW w:type="dxa" w:w="2160"/>
-          </w:tcPr>
-          <w:p>
-            <w:r>
-              <w:t>Middleware csurf</w:t>
-            </w:r>
-          </w:p>
-        </w:tc>
-        <w:tc>
-          <w:tcPr>
-            <w:tcW w:type="dxa" w:w="2160"/>
-          </w:tcPr>
-          <w:p>
-            <w:r>
-              <w:t>Protection formulaires</w:t>
-            </w:r>
-          </w:p>
-        </w:tc>
-      </w:tr>
-      <w:tr>
-        <w:tc>
-          <w:tcPr>
-            <w:tcW w:type="dxa" w:w="2160"/>
-          </w:tcPr>
-          <w:p>
-            <w:r>
-              <w:t>3.12</w:t>
-            </w:r>
-          </w:p>
-        </w:tc>
-        <w:tc>
-          <w:tcPr>
-            <w:tcW w:type="dxa" w:w="2160"/>
-          </w:tcPr>
-          <w:p>
-            <w:r>
-              <w:t>Vérifier échappement XSS</w:t>
-            </w:r>
-          </w:p>
-        </w:tc>
-        <w:tc>
-          <w:tcPr>
-            <w:tcW w:type="dxa" w:w="2160"/>
-          </w:tcPr>
-          <w:p>
-            <w:r>
-              <w:t>EJS, sanitize-html</w:t>
-            </w:r>
-          </w:p>
-        </w:tc>
-        <w:tc>
-          <w:tcPr>
-            <w:tcW w:type="dxa" w:w="2160"/>
-          </w:tcPr>
-          <w:p>
-            <w:r>
-              <w:t>Entrées utilisateur safe</w:t>
-            </w:r>
-          </w:p>
-        </w:tc>
-      </w:tr>
-      <w:tr>
-        <w:tc>
-          <w:tcPr>
-            <w:tcW w:type="dxa" w:w="2160"/>
-          </w:tcPr>
-          <w:p>
-            <w:r>
-              <w:t>3.13</w:t>
-            </w:r>
-          </w:p>
-        </w:tc>
-        <w:tc>
-          <w:tcPr>
-            <w:tcW w:type="dxa" w:w="2160"/>
-          </w:tcPr>
-          <w:p>
-            <w:r>
-              <w:t>Vérifier injection SQL</w:t>
-            </w:r>
-          </w:p>
-        </w:tc>
-        <w:tc>
-          <w:tcPr>
-            <w:tcW w:type="dxa" w:w="2160"/>
-          </w:tcPr>
-          <w:p>
-            <w:r>
-              <w:t>Sequelize parameterized</w:t>
-            </w:r>
-          </w:p>
-        </w:tc>
-        <w:tc>
-          <w:tcPr>
-            <w:tcW w:type="dxa" w:w="2160"/>
-          </w:tcPr>
-          <w:p>
-            <w:r>
-              <w:t>Requêtes sécurisées</w:t>
-            </w:r>
-          </w:p>
-        </w:tc>
-      </w:tr>
-      <w:tr>
-        <w:tc>
-          <w:tcPr>
-            <w:tcW w:type="dxa" w:w="2160"/>
-          </w:tcPr>
-          <w:p>
-            <w:r>
-              <w:t>3.14</w:t>
-            </w:r>
-          </w:p>
-        </w:tc>
-        <w:tc>
-          <w:tcPr>
-            <w:tcW w:type="dxa" w:w="2160"/>
-          </w:tcPr>
-          <w:p>
-            <w:r>
-              <w:t>Configurer helmet complet</w:t>
-            </w:r>
-          </w:p>
-        </w:tc>
-        <w:tc>
-          <w:tcPr>
-            <w:tcW w:type="dxa" w:w="2160"/>
-          </w:tcPr>
-          <w:p>
-            <w:r>
-              <w:t>`server.js`</w:t>
-            </w:r>
-          </w:p>
-        </w:tc>
-        <w:tc>
-          <w:tcPr>
-            <w:tcW w:type="dxa" w:w="2160"/>
-          </w:tcPr>
-          <w:p>
-            <w:r>
-              <w:t>CSP, HSTS, etc.</w:t>
-            </w:r>
-          </w:p>
-        </w:tc>
-      </w:tr>
-      <w:tr>
-        <w:tc>
-          <w:tcPr>
-            <w:tcW w:type="dxa" w:w="2160"/>
-          </w:tcPr>
-          <w:p>
-            <w:r>
-              <w:t>3.15</w:t>
-            </w:r>
-          </w:p>
-        </w:tc>
-        <w:tc>
-          <w:tcPr>
-            <w:tcW w:type="dxa" w:w="2160"/>
-          </w:tcPr>
-          <w:p>
-            <w:r>
-              <w:t>Optimiser images</w:t>
-            </w:r>
-          </w:p>
-        </w:tc>
-        <w:tc>
-          <w:tcPr>
-            <w:tcW w:type="dxa" w:w="2160"/>
-          </w:tcPr>
-          <w:p>
-            <w:r>
-              <w:t>Compression, lazy loading</w:t>
-            </w:r>
-          </w:p>
-        </w:tc>
-        <w:tc>
-          <w:tcPr>
-            <w:tcW w:type="dxa" w:w="2160"/>
-          </w:tcPr>
-          <w:p>
-            <w:r>
-              <w:t>Performance</w:t>
-            </w:r>
-          </w:p>
-        </w:tc>
-      </w:tr>
-      <w:tr>
-        <w:tc>
-          <w:tcPr>
-            <w:tcW w:type="dxa" w:w="2160"/>
-          </w:tcPr>
-          <w:p>
-            <w:r>
-              <w:t>3.16</w:t>
-            </w:r>
-          </w:p>
-        </w:tc>
-        <w:tc>
-          <w:tcPr>
-            <w:tcW w:type="dxa" w:w="2160"/>
-          </w:tcPr>
-          <w:p>
-            <w:r>
-              <w:t>Minifier CSS/JS (prod)</w:t>
-            </w:r>
-          </w:p>
-        </w:tc>
-        <w:tc>
-          <w:tcPr>
-            <w:tcW w:type="dxa" w:w="2160"/>
-          </w:tcPr>
-          <w:p>
-            <w:r>
-              <w:t>Build scripts</w:t>
-            </w:r>
-          </w:p>
-        </w:tc>
-        <w:tc>
-          <w:tcPr>
-            <w:tcW w:type="dxa" w:w="2160"/>
-          </w:tcPr>
-          <w:p>
-            <w:r>
-              <w:t>Bundle optimisé</w:t>
-            </w:r>
-          </w:p>
-        </w:tc>
-      </w:tr>
-      <w:tr>
-        <w:tc>
-          <w:tcPr>
-            <w:tcW w:type="dxa" w:w="2160"/>
-          </w:tcPr>
-          <w:p>
-            <w:r>
-              <w:t>3.17</w:t>
-            </w:r>
-          </w:p>
-        </w:tc>
-        <w:tc>
-          <w:tcPr>
-            <w:tcW w:type="dxa" w:w="2160"/>
-          </w:tcPr>
-          <w:p>
-            <w:r>
-              <w:t>Commit sécurité</w:t>
-            </w:r>
-          </w:p>
-        </w:tc>
-        <w:tc>
-          <w:tcPr>
-            <w:tcW w:type="dxa" w:w="2160"/>
-          </w:tcPr>
-          <w:p>
-            <w:r>
-              <w:t>`git commit -m "security: add rate limiting and security hardening"`</w:t>
-            </w:r>
-          </w:p>
-        </w:tc>
-        <w:tc>
-          <w:tcPr>
-            <w:tcW w:type="dxa" w:w="2160"/>
-          </w:tcPr>
-          <w:p>
-            <w:r/>
-          </w:p>
-        </w:tc>
-      </w:tr>
-    </w:tbl>
     <w:p>
       <w:pPr>
-        <w:pStyle w:val="Heading3"/>
+        <w:pStyle w:val="IntenseQuote"/>
       </w:pPr>
       <w:r>
-        <w:t>Semaine 3 - Jour 4 : SEO &amp; Accessibilité</w:t>
+        <w:t>**Explications des concepts de sécurité :**</w:t>
+      </w:r>
+    </w:p>
+    <w:p>
+      <w:pPr>
+        <w:pStyle w:val="IntenseQuote"/>
+      </w:pPr>
+      <w:r>
+        <w:t>- **CSRF (Cross-Site Request Forgery)** : Attaque où un site malveillant envoie des requêtes au nom d'un utilisateur connecté. Protection : vérifier l'origine des requêtes.</w:t>
+      </w:r>
+    </w:p>
+    <w:p>
+      <w:pPr>
+        <w:pStyle w:val="IntenseQuote"/>
+      </w:pPr>
+      <w:r>
+        <w:t>- **XSS (Cross-Site Scripting)** : Injection de scripts malveillants. Protection : échapper les données utilisateur (EJS le fait automatiquement avec `&lt;%= %&gt;`).</w:t>
+      </w:r>
+    </w:p>
+    <w:p>
+      <w:pPr>
+        <w:pStyle w:val="IntenseQuote"/>
+      </w:pPr>
+      <w:r>
+        <w:t>- **Rate limiting** : Limiter le nombre de requêtes pour éviter les attaques par force brute.</w:t>
       </w:r>
     </w:p>
     <w:tbl>
@@ -7922,37 +7515,37 @@
           </w:tcPr>
           <w:p>
             <w:r>
-              <w:t>3.18</w:t>
-            </w:r>
-          </w:p>
-        </w:tc>
-        <w:tc>
-          <w:tcPr>
-            <w:tcW w:type="dxa" w:w="2160"/>
-          </w:tcPr>
-          <w:p>
-            <w:r>
-              <w:t>Ajouter balises meta</w:t>
-            </w:r>
-          </w:p>
-        </w:tc>
-        <w:tc>
-          <w:tcPr>
-            <w:tcW w:type="dxa" w:w="2160"/>
-          </w:tcPr>
-          <w:p>
-            <w:r>
-              <w:t>Toutes les pages</w:t>
-            </w:r>
-          </w:p>
-        </w:tc>
-        <w:tc>
-          <w:tcPr>
-            <w:tcW w:type="dxa" w:w="2160"/>
-          </w:tcPr>
-          <w:p>
-            <w:r>
-              <w:t>Title, description uniques</w:t>
+              <w:t>3.9</w:t>
+            </w:r>
+          </w:p>
+        </w:tc>
+        <w:tc>
+          <w:tcPr>
+            <w:tcW w:type="dxa" w:w="2160"/>
+          </w:tcPr>
+          <w:p>
+            <w:r>
+              <w:t>Audit sécurité dépendances</w:t>
+            </w:r>
+          </w:p>
+        </w:tc>
+        <w:tc>
+          <w:tcPr>
+            <w:tcW w:type="dxa" w:w="2160"/>
+          </w:tcPr>
+          <w:p>
+            <w:r>
+              <w:t>`npm audit`</w:t>
+            </w:r>
+          </w:p>
+        </w:tc>
+        <w:tc>
+          <w:tcPr>
+            <w:tcW w:type="dxa" w:w="2160"/>
+          </w:tcPr>
+          <w:p>
+            <w:r>
+              <w:t>Corriger vulnérabilités</w:t>
             </w:r>
           </w:p>
         </w:tc>
@@ -7964,37 +7557,37 @@
           </w:tcPr>
           <w:p>
             <w:r>
-              <w:t>3.19</w:t>
-            </w:r>
-          </w:p>
-        </w:tc>
-        <w:tc>
-          <w:tcPr>
-            <w:tcW w:type="dxa" w:w="2160"/>
-          </w:tcPr>
-          <w:p>
-            <w:r>
-              <w:t>Ajouter Open Graph</w:t>
-            </w:r>
-          </w:p>
-        </w:tc>
-        <w:tc>
-          <w:tcPr>
-            <w:tcW w:type="dxa" w:w="2160"/>
-          </w:tcPr>
-          <w:p>
-            <w:r>
-              <w:t>`&lt;meta property="og:*"&gt;`</w:t>
-            </w:r>
-          </w:p>
-        </w:tc>
-        <w:tc>
-          <w:tcPr>
-            <w:tcW w:type="dxa" w:w="2160"/>
-          </w:tcPr>
-          <w:p>
-            <w:r>
-              <w:t>Partage réseaux sociaux</w:t>
+              <w:t>3.10</w:t>
+            </w:r>
+          </w:p>
+        </w:tc>
+        <w:tc>
+          <w:tcPr>
+            <w:tcW w:type="dxa" w:w="2160"/>
+          </w:tcPr>
+          <w:p>
+            <w:r>
+              <w:t>Vérifier échappement XSS</w:t>
+            </w:r>
+          </w:p>
+        </w:tc>
+        <w:tc>
+          <w:tcPr>
+            <w:tcW w:type="dxa" w:w="2160"/>
+          </w:tcPr>
+          <w:p>
+            <w:r>
+              <w:t>EJS avec `&lt;%= %&gt;`</w:t>
+            </w:r>
+          </w:p>
+        </w:tc>
+        <w:tc>
+          <w:tcPr>
+            <w:tcW w:type="dxa" w:w="2160"/>
+          </w:tcPr>
+          <w:p>
+            <w:r>
+              <w:t>EJS échappe automatiquement le HTML</w:t>
             </w:r>
           </w:p>
         </w:tc>
@@ -8006,37 +7599,37 @@
           </w:tcPr>
           <w:p>
             <w:r>
-              <w:t>3.20</w:t>
-            </w:r>
-          </w:p>
-        </w:tc>
-        <w:tc>
-          <w:tcPr>
-            <w:tcW w:type="dxa" w:w="2160"/>
-          </w:tcPr>
-          <w:p>
-            <w:r>
-              <w:t>Créer sitemap.xml</w:t>
-            </w:r>
-          </w:p>
-        </w:tc>
-        <w:tc>
-          <w:tcPr>
-            <w:tcW w:type="dxa" w:w="2160"/>
-          </w:tcPr>
-          <w:p>
-            <w:r>
-              <w:t>`public/sitemap.xml`</w:t>
-            </w:r>
-          </w:p>
-        </w:tc>
-        <w:tc>
-          <w:tcPr>
-            <w:tcW w:type="dxa" w:w="2160"/>
-          </w:tcPr>
-          <w:p>
-            <w:r>
-              <w:t>Index pour Google</w:t>
+              <w:t>3.11</w:t>
+            </w:r>
+          </w:p>
+        </w:tc>
+        <w:tc>
+          <w:tcPr>
+            <w:tcW w:type="dxa" w:w="2160"/>
+          </w:tcPr>
+          <w:p>
+            <w:r>
+              <w:t>Vérifier injection SQL</w:t>
+            </w:r>
+          </w:p>
+        </w:tc>
+        <w:tc>
+          <w:tcPr>
+            <w:tcW w:type="dxa" w:w="2160"/>
+          </w:tcPr>
+          <w:p>
+            <w:r>
+              <w:t>Sequelize</w:t>
+            </w:r>
+          </w:p>
+        </w:tc>
+        <w:tc>
+          <w:tcPr>
+            <w:tcW w:type="dxa" w:w="2160"/>
+          </w:tcPr>
+          <w:p>
+            <w:r>
+              <w:t>Sequelize utilise des requêtes paramétrées</w:t>
             </w:r>
           </w:p>
         </w:tc>
@@ -8048,37 +7641,37 @@
           </w:tcPr>
           <w:p>
             <w:r>
-              <w:t>3.21</w:t>
-            </w:r>
-          </w:p>
-        </w:tc>
-        <w:tc>
-          <w:tcPr>
-            <w:tcW w:type="dxa" w:w="2160"/>
-          </w:tcPr>
-          <w:p>
-            <w:r>
-              <w:t>Créer robots.txt</w:t>
-            </w:r>
-          </w:p>
-        </w:tc>
-        <w:tc>
-          <w:tcPr>
-            <w:tcW w:type="dxa" w:w="2160"/>
-          </w:tcPr>
-          <w:p>
-            <w:r>
-              <w:t>`public/robots.txt`</w:t>
-            </w:r>
-          </w:p>
-        </w:tc>
-        <w:tc>
-          <w:tcPr>
-            <w:tcW w:type="dxa" w:w="2160"/>
-          </w:tcPr>
-          <w:p>
-            <w:r>
-              <w:t>Directives crawlers</w:t>
+              <w:t>3.12</w:t>
+            </w:r>
+          </w:p>
+        </w:tc>
+        <w:tc>
+          <w:tcPr>
+            <w:tcW w:type="dxa" w:w="2160"/>
+          </w:tcPr>
+          <w:p>
+            <w:r>
+              <w:t>Sécuriser les cookies</w:t>
+            </w:r>
+          </w:p>
+        </w:tc>
+        <w:tc>
+          <w:tcPr>
+            <w:tcW w:type="dxa" w:w="2160"/>
+          </w:tcPr>
+          <w:p>
+            <w:r>
+              <w:t>`express-session` config</w:t>
+            </w:r>
+          </w:p>
+        </w:tc>
+        <w:tc>
+          <w:tcPr>
+            <w:tcW w:type="dxa" w:w="2160"/>
+          </w:tcPr>
+          <w:p>
+            <w:r>
+              <w:t>`httpOnly: true`, `secure: true` en prod</w:t>
             </w:r>
           </w:p>
         </w:tc>
@@ -8090,37 +7683,37 @@
           </w:tcPr>
           <w:p>
             <w:r>
-              <w:t>3.22</w:t>
-            </w:r>
-          </w:p>
-        </w:tc>
-        <w:tc>
-          <w:tcPr>
-            <w:tcW w:type="dxa" w:w="2160"/>
-          </w:tcPr>
-          <w:p>
-            <w:r>
-              <w:t>Ajouter Schema.org</w:t>
-            </w:r>
-          </w:p>
-        </w:tc>
-        <w:tc>
-          <w:tcPr>
-            <w:tcW w:type="dxa" w:w="2160"/>
-          </w:tcPr>
-          <w:p>
-            <w:r>
-              <w:t>JSON-LD</w:t>
-            </w:r>
-          </w:p>
-        </w:tc>
-        <w:tc>
-          <w:tcPr>
-            <w:tcW w:type="dxa" w:w="2160"/>
-          </w:tcPr>
-          <w:p>
-            <w:r>
-              <w:t>Données structurées recettes</w:t>
+              <w:t>3.13</w:t>
+            </w:r>
+          </w:p>
+        </w:tc>
+        <w:tc>
+          <w:tcPr>
+            <w:tcW w:type="dxa" w:w="2160"/>
+          </w:tcPr>
+          <w:p>
+            <w:r>
+              <w:t>Valider toutes les entrées</w:t>
+            </w:r>
+          </w:p>
+        </w:tc>
+        <w:tc>
+          <w:tcPr>
+            <w:tcW w:type="dxa" w:w="2160"/>
+          </w:tcPr>
+          <w:p>
+            <w:r>
+              <w:t>`express-validator` / `joi`</w:t>
+            </w:r>
+          </w:p>
+        </w:tc>
+        <w:tc>
+          <w:tcPr>
+            <w:tcW w:type="dxa" w:w="2160"/>
+          </w:tcPr>
+          <w:p>
+            <w:r>
+              <w:t>Aucune donnée non validée</w:t>
             </w:r>
           </w:p>
         </w:tc>
@@ -8132,37 +7725,37 @@
           </w:tcPr>
           <w:p>
             <w:r>
-              <w:t>3.23</w:t>
-            </w:r>
-          </w:p>
-        </w:tc>
-        <w:tc>
-          <w:tcPr>
-            <w:tcW w:type="dxa" w:w="2160"/>
-          </w:tcPr>
-          <w:p>
-            <w:r>
-              <w:t>Audit accessibilité</w:t>
-            </w:r>
-          </w:p>
-        </w:tc>
-        <w:tc>
-          <w:tcPr>
-            <w:tcW w:type="dxa" w:w="2160"/>
-          </w:tcPr>
-          <w:p>
-            <w:r>
-              <w:t>Lighthouse, aXe</w:t>
-            </w:r>
-          </w:p>
-        </w:tc>
-        <w:tc>
-          <w:tcPr>
-            <w:tcW w:type="dxa" w:w="2160"/>
-          </w:tcPr>
-          <w:p>
-            <w:r>
-              <w:t>Score &gt; 90</w:t>
+              <w:t>3.14</w:t>
+            </w:r>
+          </w:p>
+        </w:tc>
+        <w:tc>
+          <w:tcPr>
+            <w:tcW w:type="dxa" w:w="2160"/>
+          </w:tcPr>
+          <w:p>
+            <w:r>
+              <w:t>Tester scénarios de sécurité</w:t>
+            </w:r>
+          </w:p>
+        </w:tc>
+        <w:tc>
+          <w:tcPr>
+            <w:tcW w:type="dxa" w:w="2160"/>
+          </w:tcPr>
+          <w:p>
+            <w:r>
+              <w:t>Manual testing</w:t>
+            </w:r>
+          </w:p>
+        </w:tc>
+        <w:tc>
+          <w:tcPr>
+            <w:tcW w:type="dxa" w:w="2160"/>
+          </w:tcPr>
+          <w:p>
+            <w:r>
+              <w:t>Tentatives d'injection, accès non autorisé</w:t>
             </w:r>
           </w:p>
         </w:tc>
@@ -8174,37 +7767,119 @@
           </w:tcPr>
           <w:p>
             <w:r>
-              <w:t>3.24</w:t>
-            </w:r>
-          </w:p>
-        </w:tc>
-        <w:tc>
-          <w:tcPr>
-            <w:tcW w:type="dxa" w:w="2160"/>
-          </w:tcPr>
-          <w:p>
-            <w:r>
-              <w:t>Corriger problèmes a11y</w:t>
-            </w:r>
-          </w:p>
-        </w:tc>
-        <w:tc>
-          <w:tcPr>
-            <w:tcW w:type="dxa" w:w="2160"/>
-          </w:tcPr>
-          <w:p>
-            <w:r>
-              <w:t>Contraste, alt, labels</w:t>
-            </w:r>
-          </w:p>
-        </w:tc>
-        <w:tc>
-          <w:tcPr>
-            <w:tcW w:type="dxa" w:w="2160"/>
-          </w:tcPr>
-          <w:p>
-            <w:r>
-              <w:t>Conformité WCAG</w:t>
+              <w:t>3.15</w:t>
+            </w:r>
+          </w:p>
+        </w:tc>
+        <w:tc>
+          <w:tcPr>
+            <w:tcW w:type="dxa" w:w="2160"/>
+          </w:tcPr>
+          <w:p>
+            <w:r>
+              <w:t>Commit sécurité</w:t>
+            </w:r>
+          </w:p>
+        </w:tc>
+        <w:tc>
+          <w:tcPr>
+            <w:tcW w:type="dxa" w:w="2160"/>
+          </w:tcPr>
+          <w:p>
+            <w:r>
+              <w:t>`git commit -m "security: add input validation and secure cookies"`</w:t>
+            </w:r>
+          </w:p>
+        </w:tc>
+        <w:tc>
+          <w:tcPr>
+            <w:tcW w:type="dxa" w:w="2160"/>
+          </w:tcPr>
+          <w:p>
+            <w:r/>
+          </w:p>
+        </w:tc>
+      </w:tr>
+    </w:tbl>
+    <w:p>
+      <w:pPr>
+        <w:pStyle w:val="Heading3"/>
+      </w:pPr>
+      <w:r>
+        <w:t>Semaine 3 - Jour 4 : SEO &amp; Accessibilité (Simplifié)</w:t>
+      </w:r>
+    </w:p>
+    <w:p>
+      <w:pPr>
+        <w:pStyle w:val="IntenseQuote"/>
+      </w:pPr>
+      <w:r>
+        <w:t>**SEO Essentiel** : Les éléments ci-dessous sont les plus importants pour le référencement. Les items avancés (sitemap, robots.txt, Schema.org) sont optionnels pour le MVP.</w:t>
+      </w:r>
+    </w:p>
+    <w:tbl>
+      <w:tblPr>
+        <w:tblStyle w:val="TableGrid"/>
+        <w:tblW w:type="auto" w:w="0"/>
+        <w:jc w:val="center"/>
+        <w:tblLook w:firstColumn="1" w:firstRow="1" w:lastColumn="0" w:lastRow="0" w:noHBand="0" w:noVBand="1" w:val="04A0"/>
+      </w:tblPr>
+      <w:tblGrid>
+        <w:gridCol w:w="2160"/>
+        <w:gridCol w:w="2160"/>
+        <w:gridCol w:w="2160"/>
+        <w:gridCol w:w="2160"/>
+      </w:tblGrid>
+      <w:tr>
+        <w:tc>
+          <w:tcPr>
+            <w:tcW w:type="dxa" w:w="2160"/>
+          </w:tcPr>
+          <w:p>
+            <w:r>
+              <w:rPr>
+                <w:b/>
+              </w:rPr>
+              <w:t>#</w:t>
+            </w:r>
+          </w:p>
+        </w:tc>
+        <w:tc>
+          <w:tcPr>
+            <w:tcW w:type="dxa" w:w="2160"/>
+          </w:tcPr>
+          <w:p>
+            <w:r>
+              <w:rPr>
+                <w:b/>
+              </w:rPr>
+              <w:t>Tâche</w:t>
+            </w:r>
+          </w:p>
+        </w:tc>
+        <w:tc>
+          <w:tcPr>
+            <w:tcW w:type="dxa" w:w="2160"/>
+          </w:tcPr>
+          <w:p>
+            <w:r>
+              <w:rPr>
+                <w:b/>
+              </w:rPr>
+              <w:t>Fichier</w:t>
+            </w:r>
+          </w:p>
+        </w:tc>
+        <w:tc>
+          <w:tcPr>
+            <w:tcW w:type="dxa" w:w="2160"/>
+          </w:tcPr>
+          <w:p>
+            <w:r>
+              <w:rPr>
+                <w:b/>
+              </w:rPr>
+              <w:t>Description</w:t>
             </w:r>
           </w:p>
         </w:tc>
@@ -8216,37 +7891,37 @@
           </w:tcPr>
           <w:p>
             <w:r>
-              <w:t>3.25</w:t>
-            </w:r>
-          </w:p>
-        </w:tc>
-        <w:tc>
-          <w:tcPr>
-            <w:tcW w:type="dxa" w:w="2160"/>
-          </w:tcPr>
-          <w:p>
-            <w:r>
-              <w:t>Ajouter skip links</w:t>
-            </w:r>
-          </w:p>
-        </w:tc>
-        <w:tc>
-          <w:tcPr>
-            <w:tcW w:type="dxa" w:w="2160"/>
-          </w:tcPr>
-          <w:p>
-            <w:r>
-              <w:t>Navigation clavier</w:t>
-            </w:r>
-          </w:p>
-        </w:tc>
-        <w:tc>
-          <w:tcPr>
-            <w:tcW w:type="dxa" w:w="2160"/>
-          </w:tcPr>
-          <w:p>
-            <w:r>
-              <w:t>Accessibilité</w:t>
+              <w:t>3.16</w:t>
+            </w:r>
+          </w:p>
+        </w:tc>
+        <w:tc>
+          <w:tcPr>
+            <w:tcW w:type="dxa" w:w="2160"/>
+          </w:tcPr>
+          <w:p>
+            <w:r>
+              <w:t>Ajouter balise `&lt;title&gt;`</w:t>
+            </w:r>
+          </w:p>
+        </w:tc>
+        <w:tc>
+          <w:tcPr>
+            <w:tcW w:type="dxa" w:w="2160"/>
+          </w:tcPr>
+          <w:p>
+            <w:r>
+              <w:t>Toutes les pages EJS</w:t>
+            </w:r>
+          </w:p>
+        </w:tc>
+        <w:tc>
+          <w:tcPr>
+            <w:tcW w:type="dxa" w:w="2160"/>
+          </w:tcPr>
+          <w:p>
+            <w:r>
+              <w:t>Titre unique par page (ex: "Ratatouille - Ciné Délices")</w:t>
             </w:r>
           </w:p>
         </w:tc>
@@ -8258,37 +7933,37 @@
           </w:tcPr>
           <w:p>
             <w:r>
-              <w:t>3.26</w:t>
-            </w:r>
-          </w:p>
-        </w:tc>
-        <w:tc>
-          <w:tcPr>
-            <w:tcW w:type="dxa" w:w="2160"/>
-          </w:tcPr>
-          <w:p>
-            <w:r>
-              <w:t>Tester navigation clavier</w:t>
-            </w:r>
-          </w:p>
-        </w:tc>
-        <w:tc>
-          <w:tcPr>
-            <w:tcW w:type="dxa" w:w="2160"/>
-          </w:tcPr>
-          <w:p>
-            <w:r>
-              <w:t>Manual testing</w:t>
-            </w:r>
-          </w:p>
-        </w:tc>
-        <w:tc>
-          <w:tcPr>
-            <w:tcW w:type="dxa" w:w="2160"/>
-          </w:tcPr>
-          <w:p>
-            <w:r>
-              <w:t>Tab navigation complète</w:t>
+              <w:t>3.17</w:t>
+            </w:r>
+          </w:p>
+        </w:tc>
+        <w:tc>
+          <w:tcPr>
+            <w:tcW w:type="dxa" w:w="2160"/>
+          </w:tcPr>
+          <w:p>
+            <w:r>
+              <w:t>Ajouter meta description</w:t>
+            </w:r>
+          </w:p>
+        </w:tc>
+        <w:tc>
+          <w:tcPr>
+            <w:tcW w:type="dxa" w:w="2160"/>
+          </w:tcPr>
+          <w:p>
+            <w:r>
+              <w:t>`&lt;meta name="description"&gt;`</w:t>
+            </w:r>
+          </w:p>
+        </w:tc>
+        <w:tc>
+          <w:tcPr>
+            <w:tcW w:type="dxa" w:w="2160"/>
+          </w:tcPr>
+          <w:p>
+            <w:r>
+              <w:t>Description courte (max 160 caractères)</w:t>
             </w:r>
           </w:p>
         </w:tc>
@@ -8300,27 +7975,195 @@
           </w:tcPr>
           <w:p>
             <w:r>
-              <w:t>3.27</w:t>
-            </w:r>
-          </w:p>
-        </w:tc>
-        <w:tc>
-          <w:tcPr>
-            <w:tcW w:type="dxa" w:w="2160"/>
-          </w:tcPr>
-          <w:p>
-            <w:r>
-              <w:t>Commit SEO/A11y</w:t>
-            </w:r>
-          </w:p>
-        </w:tc>
-        <w:tc>
-          <w:tcPr>
-            <w:tcW w:type="dxa" w:w="2160"/>
-          </w:tcPr>
-          <w:p>
-            <w:r>
-              <w:t>`git commit -m "feat(seo): add meta tags, sitemap, and a11y fixes"`</w:t>
+              <w:t>3.18</w:t>
+            </w:r>
+          </w:p>
+        </w:tc>
+        <w:tc>
+          <w:tcPr>
+            <w:tcW w:type="dxa" w:w="2160"/>
+          </w:tcPr>
+          <w:p>
+            <w:r>
+              <w:t>Utiliser structure HTML sémantique</w:t>
+            </w:r>
+          </w:p>
+        </w:tc>
+        <w:tc>
+          <w:tcPr>
+            <w:tcW w:type="dxa" w:w="2160"/>
+          </w:tcPr>
+          <w:p>
+            <w:r>
+              <w:t>`&lt;header&gt;`, `&lt;main&gt;`, `&lt;footer&gt;`, `&lt;article&gt;`</w:t>
+            </w:r>
+          </w:p>
+        </w:tc>
+        <w:tc>
+          <w:tcPr>
+            <w:tcW w:type="dxa" w:w="2160"/>
+          </w:tcPr>
+          <w:p>
+            <w:r>
+              <w:t>Améliore le SEO et l'accessibilité</w:t>
+            </w:r>
+          </w:p>
+        </w:tc>
+      </w:tr>
+      <w:tr>
+        <w:tc>
+          <w:tcPr>
+            <w:tcW w:type="dxa" w:w="2160"/>
+          </w:tcPr>
+          <w:p>
+            <w:r>
+              <w:t>3.19</w:t>
+            </w:r>
+          </w:p>
+        </w:tc>
+        <w:tc>
+          <w:tcPr>
+            <w:tcW w:type="dxa" w:w="2160"/>
+          </w:tcPr>
+          <w:p>
+            <w:r>
+              <w:t>Ajouter attributs alt aux images</w:t>
+            </w:r>
+          </w:p>
+        </w:tc>
+        <w:tc>
+          <w:tcPr>
+            <w:tcW w:type="dxa" w:w="2160"/>
+          </w:tcPr>
+          <w:p>
+            <w:r>
+              <w:t>Toutes les `&lt;img&gt;`</w:t>
+            </w:r>
+          </w:p>
+        </w:tc>
+        <w:tc>
+          <w:tcPr>
+            <w:tcW w:type="dxa" w:w="2160"/>
+          </w:tcPr>
+          <w:p>
+            <w:r>
+              <w:t>Description textuelle des images</w:t>
+            </w:r>
+          </w:p>
+        </w:tc>
+      </w:tr>
+      <w:tr>
+        <w:tc>
+          <w:tcPr>
+            <w:tcW w:type="dxa" w:w="2160"/>
+          </w:tcPr>
+          <w:p>
+            <w:r>
+              <w:t>3.20</w:t>
+            </w:r>
+          </w:p>
+        </w:tc>
+        <w:tc>
+          <w:tcPr>
+            <w:tcW w:type="dxa" w:w="2160"/>
+          </w:tcPr>
+          <w:p>
+            <w:r>
+              <w:t>Tester avec Lighthouse</w:t>
+            </w:r>
+          </w:p>
+        </w:tc>
+        <w:tc>
+          <w:tcPr>
+            <w:tcW w:type="dxa" w:w="2160"/>
+          </w:tcPr>
+          <w:p>
+            <w:r>
+              <w:t>Chrome DevTools → Lighthouse</w:t>
+            </w:r>
+          </w:p>
+        </w:tc>
+        <w:tc>
+          <w:tcPr>
+            <w:tcW w:type="dxa" w:w="2160"/>
+          </w:tcPr>
+          <w:p>
+            <w:r>
+              <w:t>Score SEO et accessibilité</w:t>
+            </w:r>
+          </w:p>
+        </w:tc>
+      </w:tr>
+      <w:tr>
+        <w:tc>
+          <w:tcPr>
+            <w:tcW w:type="dxa" w:w="2160"/>
+          </w:tcPr>
+          <w:p>
+            <w:r>
+              <w:t>3.21</w:t>
+            </w:r>
+          </w:p>
+        </w:tc>
+        <w:tc>
+          <w:tcPr>
+            <w:tcW w:type="dxa" w:w="2160"/>
+          </w:tcPr>
+          <w:p>
+            <w:r>
+              <w:t>Corriger problèmes identifiés</w:t>
+            </w:r>
+          </w:p>
+        </w:tc>
+        <w:tc>
+          <w:tcPr>
+            <w:tcW w:type="dxa" w:w="2160"/>
+          </w:tcPr>
+          <w:p>
+            <w:r>
+              <w:t>Selon rapport Lighthouse</w:t>
+            </w:r>
+          </w:p>
+        </w:tc>
+        <w:tc>
+          <w:tcPr>
+            <w:tcW w:type="dxa" w:w="2160"/>
+          </w:tcPr>
+          <w:p>
+            <w:r>
+              <w:t>Améliorer les scores</w:t>
+            </w:r>
+          </w:p>
+        </w:tc>
+      </w:tr>
+      <w:tr>
+        <w:tc>
+          <w:tcPr>
+            <w:tcW w:type="dxa" w:w="2160"/>
+          </w:tcPr>
+          <w:p>
+            <w:r>
+              <w:t>3.22</w:t>
+            </w:r>
+          </w:p>
+        </w:tc>
+        <w:tc>
+          <w:tcPr>
+            <w:tcW w:type="dxa" w:w="2160"/>
+          </w:tcPr>
+          <w:p>
+            <w:r>
+              <w:t>Commit SEO</w:t>
+            </w:r>
+          </w:p>
+        </w:tc>
+        <w:tc>
+          <w:tcPr>
+            <w:tcW w:type="dxa" w:w="2160"/>
+          </w:tcPr>
+          <w:p>
+            <w:r>
+              <w:t>`git commit -m "feat(seo): add meta tags and semantic HTML"`</w:t>
             </w:r>
           </w:p>
         </w:tc>
@@ -8334,6 +8177,35 @@
         </w:tc>
       </w:tr>
     </w:tbl>
+    <w:p>
+      <w:r>
+        <w:t>Optionnel (bonus) :</w:t>
+      </w:r>
+    </w:p>
+    <w:p>
+      <w:pPr>
+        <w:pStyle w:val="ListBullet"/>
+      </w:pPr>
+      <w:r>
+        <w:t>`robots.txt` : Fichier indiquant aux moteurs de recherche quelles pages indexer</w:t>
+      </w:r>
+    </w:p>
+    <w:p>
+      <w:pPr>
+        <w:pStyle w:val="ListBullet"/>
+      </w:pPr>
+      <w:r>
+        <w:t>`sitemap.xml` : Liste de toutes les pages pour Google</w:t>
+      </w:r>
+    </w:p>
+    <w:p>
+      <w:pPr>
+        <w:pStyle w:val="ListBullet"/>
+      </w:pPr>
+      <w:r>
+        <w:t>Open Graph : Balises pour un bel affichage lors du partage sur les réseaux sociaux</w:t>
+      </w:r>
+    </w:p>
     <w:p>
       <w:pPr>
         <w:pStyle w:val="Heading3"/>

</xml_diff>

<commit_message>
docs: regenerate Word document with AI feature
</commit_message>
<xml_diff>
--- a/dev-notes.docx
+++ b/dev-notes.docx
@@ -6295,6 +6295,762 @@
         </w:tc>
       </w:tr>
     </w:tbl>
+    <w:p>
+      <w:r>
+        <w:t>──────────────────────────────────────────────────</w:t>
+      </w:r>
+    </w:p>
+    <w:p>
+      <w:pPr>
+        <w:pStyle w:val="Heading3"/>
+      </w:pPr>
+      <w:r>
+        <w:t>🤖 BONUS : Génération de Recette Assistée par IA (Optionnel)</w:t>
+      </w:r>
+    </w:p>
+    <w:p>
+      <w:pPr>
+        <w:pStyle w:val="IntenseQuote"/>
+      </w:pPr>
+      <w:r>
+        <w:t>**⚠️ Feature Bonus** : Cette fonctionnalité est **entièrement optionnelle**. Ne l'implémenter que si :</w:t>
+      </w:r>
+    </w:p>
+    <w:p>
+      <w:pPr>
+        <w:pStyle w:val="IntenseQuote"/>
+      </w:pPr>
+      <w:r>
+        <w:t>- Le MVP est fonctionnel</w:t>
+      </w:r>
+    </w:p>
+    <w:p>
+      <w:pPr>
+        <w:pStyle w:val="IntenseQuote"/>
+      </w:pPr>
+      <w:r>
+        <w:t>- L'équipe a du temps disponible</w:t>
+      </w:r>
+    </w:p>
+    <w:p>
+      <w:pPr>
+        <w:pStyle w:val="IntenseQuote"/>
+      </w:pPr>
+      <w:r>
+        <w:t>- Vous voulez un élément différenciant pour le portfolio</w:t>
+      </w:r>
+    </w:p>
+    <w:p>
+      <w:pPr>
+        <w:pStyle w:val="IntenseQuote"/>
+      </w:pPr>
+      <w:r>
+        <w:t>**Objectif** : Accélérer la création de recettes en proposant un pré-remplissage automatique basé sur le film/série sélectionné, tout en laissant le contrôle éditorial total à l'utilisateur.</w:t>
+      </w:r>
+    </w:p>
+    <w:p>
+      <w:r>
+        <w:t>Placement : Intégré au formulaire de création de recette existant</w:t>
+      </w:r>
+    </w:p>
+    <w:tbl>
+      <w:tblPr>
+        <w:tblStyle w:val="TableGrid"/>
+        <w:tblW w:type="auto" w:w="0"/>
+        <w:jc w:val="center"/>
+        <w:tblLook w:firstColumn="1" w:firstRow="1" w:lastColumn="0" w:lastRow="0" w:noHBand="0" w:noVBand="1" w:val="04A0"/>
+      </w:tblPr>
+      <w:tblGrid>
+        <w:gridCol w:w="2160"/>
+        <w:gridCol w:w="2160"/>
+        <w:gridCol w:w="2160"/>
+        <w:gridCol w:w="2160"/>
+      </w:tblGrid>
+      <w:tr>
+        <w:tc>
+          <w:tcPr>
+            <w:tcW w:type="dxa" w:w="2160"/>
+          </w:tcPr>
+          <w:p>
+            <w:r>
+              <w:rPr>
+                <w:b/>
+              </w:rPr>
+              <w:t>#</w:t>
+            </w:r>
+          </w:p>
+        </w:tc>
+        <w:tc>
+          <w:tcPr>
+            <w:tcW w:type="dxa" w:w="2160"/>
+          </w:tcPr>
+          <w:p>
+            <w:r>
+              <w:rPr>
+                <w:b/>
+              </w:rPr>
+              <w:t>Tâche</w:t>
+            </w:r>
+          </w:p>
+        </w:tc>
+        <w:tc>
+          <w:tcPr>
+            <w:tcW w:type="dxa" w:w="2160"/>
+          </w:tcPr>
+          <w:p>
+            <w:r>
+              <w:rPr>
+                <w:b/>
+              </w:rPr>
+              <w:t>Fichier</w:t>
+            </w:r>
+          </w:p>
+        </w:tc>
+        <w:tc>
+          <w:tcPr>
+            <w:tcW w:type="dxa" w:w="2160"/>
+          </w:tcPr>
+          <w:p>
+            <w:r>
+              <w:rPr>
+                <w:b/>
+              </w:rPr>
+              <w:t>Description</w:t>
+            </w:r>
+          </w:p>
+        </w:tc>
+      </w:tr>
+      <w:tr>
+        <w:tc>
+          <w:tcPr>
+            <w:tcW w:type="dxa" w:w="2160"/>
+          </w:tcPr>
+          <w:p>
+            <w:r>
+              <w:t>2.44b</w:t>
+            </w:r>
+          </w:p>
+        </w:tc>
+        <w:tc>
+          <w:tcPr>
+            <w:tcW w:type="dxa" w:w="2160"/>
+          </w:tcPr>
+          <w:p>
+            <w:r>
+              <w:t>Créer variable d'environnement</w:t>
+            </w:r>
+          </w:p>
+        </w:tc>
+        <w:tc>
+          <w:tcPr>
+            <w:tcW w:type="dxa" w:w="2160"/>
+          </w:tcPr>
+          <w:p>
+            <w:r>
+              <w:t>`.env`</w:t>
+            </w:r>
+          </w:p>
+        </w:tc>
+        <w:tc>
+          <w:tcPr>
+            <w:tcW w:type="dxa" w:w="2160"/>
+          </w:tcPr>
+          <w:p>
+            <w:r>
+              <w:t>`GEMINI_API_KEY`, `AI_ENABLED=true`</w:t>
+            </w:r>
+          </w:p>
+        </w:tc>
+      </w:tr>
+      <w:tr>
+        <w:tc>
+          <w:tcPr>
+            <w:tcW w:type="dxa" w:w="2160"/>
+          </w:tcPr>
+          <w:p>
+            <w:r>
+              <w:t>2.45b</w:t>
+            </w:r>
+          </w:p>
+        </w:tc>
+        <w:tc>
+          <w:tcPr>
+            <w:tcW w:type="dxa" w:w="2160"/>
+          </w:tcPr>
+          <w:p>
+            <w:r>
+              <w:t>Ajouter bouton "Suggérer avec l'IA"</w:t>
+            </w:r>
+          </w:p>
+        </w:tc>
+        <w:tc>
+          <w:tcPr>
+            <w:tcW w:type="dxa" w:w="2160"/>
+          </w:tcPr>
+          <w:p>
+            <w:r>
+              <w:t>`recipe-form.ejs`</w:t>
+            </w:r>
+          </w:p>
+        </w:tc>
+        <w:tc>
+          <w:tcPr>
+            <w:tcW w:type="dxa" w:w="2160"/>
+          </w:tcPr>
+          <w:p>
+            <w:r>
+              <w:t>Bouton affiché uniquement si média sélectionné</w:t>
+            </w:r>
+          </w:p>
+        </w:tc>
+      </w:tr>
+      <w:tr>
+        <w:tc>
+          <w:tcPr>
+            <w:tcW w:type="dxa" w:w="2160"/>
+          </w:tcPr>
+          <w:p>
+            <w:r>
+              <w:t>2.46b</w:t>
+            </w:r>
+          </w:p>
+        </w:tc>
+        <w:tc>
+          <w:tcPr>
+            <w:tcW w:type="dxa" w:w="2160"/>
+          </w:tcPr>
+          <w:p>
+            <w:r>
+              <w:t>Créer service IA</w:t>
+            </w:r>
+          </w:p>
+        </w:tc>
+        <w:tc>
+          <w:tcPr>
+            <w:tcW w:type="dxa" w:w="2160"/>
+          </w:tcPr>
+          <w:p>
+            <w:r>
+              <w:t>`src/services/aiRecipeService.js`</w:t>
+            </w:r>
+          </w:p>
+        </w:tc>
+        <w:tc>
+          <w:tcPr>
+            <w:tcW w:type="dxa" w:w="2160"/>
+          </w:tcPr>
+          <w:p>
+            <w:r>
+              <w:t>Appel API Gemini pour génération</w:t>
+            </w:r>
+          </w:p>
+        </w:tc>
+      </w:tr>
+      <w:tr>
+        <w:tc>
+          <w:tcPr>
+            <w:tcW w:type="dxa" w:w="2160"/>
+          </w:tcPr>
+          <w:p>
+            <w:r>
+              <w:t>2.47b</w:t>
+            </w:r>
+          </w:p>
+        </w:tc>
+        <w:tc>
+          <w:tcPr>
+            <w:tcW w:type="dxa" w:w="2160"/>
+          </w:tcPr>
+          <w:p>
+            <w:r>
+              <w:t>Créer endpoint génération</w:t>
+            </w:r>
+          </w:p>
+        </w:tc>
+        <w:tc>
+          <w:tcPr>
+            <w:tcW w:type="dxa" w:w="2160"/>
+          </w:tcPr>
+          <w:p>
+            <w:r>
+              <w:t>`recipeController.generateFromMedia()`</w:t>
+            </w:r>
+          </w:p>
+        </w:tc>
+        <w:tc>
+          <w:tcPr>
+            <w:tcW w:type="dxa" w:w="2160"/>
+          </w:tcPr>
+          <w:p>
+            <w:r>
+              <w:t>Route POST `/api/recipes/generate`</w:t>
+            </w:r>
+          </w:p>
+        </w:tc>
+      </w:tr>
+      <w:tr>
+        <w:tc>
+          <w:tcPr>
+            <w:tcW w:type="dxa" w:w="2160"/>
+          </w:tcPr>
+          <w:p>
+            <w:r>
+              <w:t>2.48b</w:t>
+            </w:r>
+          </w:p>
+        </w:tc>
+        <w:tc>
+          <w:tcPr>
+            <w:tcW w:type="dxa" w:w="2160"/>
+          </w:tcPr>
+          <w:p>
+            <w:r>
+              <w:t>Implémenter prompt template</w:t>
+            </w:r>
+          </w:p>
+        </w:tc>
+        <w:tc>
+          <w:tcPr>
+            <w:tcW w:type="dxa" w:w="2160"/>
+          </w:tcPr>
+          <w:p>
+            <w:r>
+              <w:t>`aiRecipeService.js`</w:t>
+            </w:r>
+          </w:p>
+        </w:tc>
+        <w:tc>
+          <w:tcPr>
+            <w:tcW w:type="dxa" w:w="2160"/>
+          </w:tcPr>
+          <w:p>
+            <w:r>
+              <w:t>Template structuré film → JSON recette</w:t>
+            </w:r>
+          </w:p>
+        </w:tc>
+      </w:tr>
+      <w:tr>
+        <w:tc>
+          <w:tcPr>
+            <w:tcW w:type="dxa" w:w="2160"/>
+          </w:tcPr>
+          <w:p>
+            <w:r>
+              <w:t>2.49b</w:t>
+            </w:r>
+          </w:p>
+        </w:tc>
+        <w:tc>
+          <w:tcPr>
+            <w:tcW w:type="dxa" w:w="2160"/>
+          </w:tcPr>
+          <w:p>
+            <w:r>
+              <w:t>Ajouter gestion front-end</w:t>
+            </w:r>
+          </w:p>
+        </w:tc>
+        <w:tc>
+          <w:tcPr>
+            <w:tcW w:type="dxa" w:w="2160"/>
+          </w:tcPr>
+          <w:p>
+            <w:r>
+              <w:t>`public/js/recipe-form.js`</w:t>
+            </w:r>
+          </w:p>
+        </w:tc>
+        <w:tc>
+          <w:tcPr>
+            <w:tcW w:type="dxa" w:w="2160"/>
+          </w:tcPr>
+          <w:p>
+            <w:r>
+              <w:t>Fetch API, loading state, pré-remplissage</w:t>
+            </w:r>
+          </w:p>
+        </w:tc>
+      </w:tr>
+      <w:tr>
+        <w:tc>
+          <w:tcPr>
+            <w:tcW w:type="dxa" w:w="2160"/>
+          </w:tcPr>
+          <w:p>
+            <w:r>
+              <w:t>2.50b</w:t>
+            </w:r>
+          </w:p>
+        </w:tc>
+        <w:tc>
+          <w:tcPr>
+            <w:tcW w:type="dxa" w:w="2160"/>
+          </w:tcPr>
+          <w:p>
+            <w:r>
+              <w:t>Gestion des erreurs</w:t>
+            </w:r>
+          </w:p>
+        </w:tc>
+        <w:tc>
+          <w:tcPr>
+            <w:tcW w:type="dxa" w:w="2160"/>
+          </w:tcPr>
+          <w:p>
+            <w:r>
+              <w:t>Frontend + Backend</w:t>
+            </w:r>
+          </w:p>
+        </w:tc>
+        <w:tc>
+          <w:tcPr>
+            <w:tcW w:type="dxa" w:w="2160"/>
+          </w:tcPr>
+          <w:p>
+            <w:r>
+              <w:t>Timeout, rate limit, fallback manuel</w:t>
+            </w:r>
+          </w:p>
+        </w:tc>
+      </w:tr>
+      <w:tr>
+        <w:tc>
+          <w:tcPr>
+            <w:tcW w:type="dxa" w:w="2160"/>
+          </w:tcPr>
+          <w:p>
+            <w:r>
+              <w:t>2.51b</w:t>
+            </w:r>
+          </w:p>
+        </w:tc>
+        <w:tc>
+          <w:tcPr>
+            <w:tcW w:type="dxa" w:w="2160"/>
+          </w:tcPr>
+          <w:p>
+            <w:r>
+              <w:t>Tester scénario complet</w:t>
+            </w:r>
+          </w:p>
+        </w:tc>
+        <w:tc>
+          <w:tcPr>
+            <w:tcW w:type="dxa" w:w="2160"/>
+          </w:tcPr>
+          <w:p>
+            <w:r>
+              <w:t>Manual testing</w:t>
+            </w:r>
+          </w:p>
+        </w:tc>
+        <w:tc>
+          <w:tcPr>
+            <w:tcW w:type="dxa" w:w="2160"/>
+          </w:tcPr>
+          <w:p>
+            <w:r>
+              <w:t>Sélection → Génération → Édition → Soumission</w:t>
+            </w:r>
+          </w:p>
+        </w:tc>
+      </w:tr>
+      <w:tr>
+        <w:tc>
+          <w:tcPr>
+            <w:tcW w:type="dxa" w:w="2160"/>
+          </w:tcPr>
+          <w:p>
+            <w:r>
+              <w:t>2.52b</w:t>
+            </w:r>
+          </w:p>
+        </w:tc>
+        <w:tc>
+          <w:tcPr>
+            <w:tcW w:type="dxa" w:w="2160"/>
+          </w:tcPr>
+          <w:p>
+            <w:r>
+              <w:t>Commit feature IA</w:t>
+            </w:r>
+          </w:p>
+        </w:tc>
+        <w:tc>
+          <w:tcPr>
+            <w:tcW w:type="dxa" w:w="2160"/>
+          </w:tcPr>
+          <w:p>
+            <w:r>
+              <w:t>Git</w:t>
+            </w:r>
+          </w:p>
+        </w:tc>
+        <w:tc>
+          <w:tcPr>
+            <w:tcW w:type="dxa" w:w="2160"/>
+          </w:tcPr>
+          <w:p>
+            <w:r>
+              <w:t>`feat(ai): add AI-assisted recipe generation`</w:t>
+            </w:r>
+          </w:p>
+        </w:tc>
+      </w:tr>
+    </w:tbl>
+    <w:p>
+      <w:r>
+        <w:t>Choix Technique :</w:t>
+      </w:r>
+    </w:p>
+    <w:tbl>
+      <w:tblPr>
+        <w:tblStyle w:val="TableGrid"/>
+        <w:tblW w:type="auto" w:w="0"/>
+        <w:jc w:val="center"/>
+        <w:tblLook w:firstColumn="1" w:firstRow="1" w:lastColumn="0" w:lastRow="0" w:noHBand="0" w:noVBand="1" w:val="04A0"/>
+      </w:tblPr>
+      <w:tblGrid>
+        <w:gridCol w:w="2880"/>
+        <w:gridCol w:w="2880"/>
+        <w:gridCol w:w="2880"/>
+      </w:tblGrid>
+      <w:tr>
+        <w:tc>
+          <w:tcPr>
+            <w:tcW w:type="dxa" w:w="2880"/>
+          </w:tcPr>
+          <w:p>
+            <w:r>
+              <w:rPr>
+                <w:b/>
+              </w:rPr>
+              <w:t>Décision</w:t>
+            </w:r>
+          </w:p>
+        </w:tc>
+        <w:tc>
+          <w:tcPr>
+            <w:tcW w:type="dxa" w:w="2880"/>
+          </w:tcPr>
+          <w:p>
+            <w:r>
+              <w:rPr>
+                <w:b/>
+              </w:rPr>
+              <w:t>Choix</w:t>
+            </w:r>
+          </w:p>
+        </w:tc>
+        <w:tc>
+          <w:tcPr>
+            <w:tcW w:type="dxa" w:w="2880"/>
+          </w:tcPr>
+          <w:p>
+            <w:r>
+              <w:rPr>
+                <w:b/>
+              </w:rPr>
+              <w:t>Justification</w:t>
+            </w:r>
+          </w:p>
+        </w:tc>
+      </w:tr>
+      <w:tr>
+        <w:tc>
+          <w:tcPr>
+            <w:tcW w:type="dxa" w:w="2880"/>
+          </w:tcPr>
+          <w:p>
+            <w:r>
+              <w:t>**LLM Provider**</w:t>
+            </w:r>
+          </w:p>
+        </w:tc>
+        <w:tc>
+          <w:tcPr>
+            <w:tcW w:type="dxa" w:w="2880"/>
+          </w:tcPr>
+          <w:p>
+            <w:r>
+              <w:t>Google Gemini 1.5 Flash</w:t>
+            </w:r>
+          </w:p>
+        </w:tc>
+        <w:tc>
+          <w:tcPr>
+            <w:tcW w:type="dxa" w:w="2880"/>
+          </w:tcPr>
+          <w:p>
+            <w:r>
+              <w:t>Tier gratuit généreux (15 req/min)</w:t>
+            </w:r>
+          </w:p>
+        </w:tc>
+      </w:tr>
+      <w:tr>
+        <w:tc>
+          <w:tcPr>
+            <w:tcW w:type="dxa" w:w="2880"/>
+          </w:tcPr>
+          <w:p>
+            <w:r>
+              <w:t>**Fallback**</w:t>
+            </w:r>
+          </w:p>
+        </w:tc>
+        <w:tc>
+          <w:tcPr>
+            <w:tcW w:type="dxa" w:w="2880"/>
+          </w:tcPr>
+          <w:p>
+            <w:r>
+              <w:t>Désactivation gracieuse</w:t>
+            </w:r>
+          </w:p>
+        </w:tc>
+        <w:tc>
+          <w:tcPr>
+            <w:tcW w:type="dxa" w:w="2880"/>
+          </w:tcPr>
+          <w:p>
+            <w:r>
+              <w:t>Si quota dépassé ou API down, formulaire manuel</w:t>
+            </w:r>
+          </w:p>
+        </w:tc>
+      </w:tr>
+      <w:tr>
+        <w:tc>
+          <w:tcPr>
+            <w:tcW w:type="dxa" w:w="2880"/>
+          </w:tcPr>
+          <w:p>
+            <w:r>
+              <w:t>**Format réponse**</w:t>
+            </w:r>
+          </w:p>
+        </w:tc>
+        <w:tc>
+          <w:tcPr>
+            <w:tcW w:type="dxa" w:w="2880"/>
+          </w:tcPr>
+          <w:p>
+            <w:r>
+              <w:t>JSON structuré</w:t>
+            </w:r>
+          </w:p>
+        </w:tc>
+        <w:tc>
+          <w:tcPr>
+            <w:tcW w:type="dxa" w:w="2880"/>
+          </w:tcPr>
+          <w:p>
+            <w:r>
+              <w:t>`{title, ingredients[], steps[], anecdote}`</w:t>
+            </w:r>
+          </w:p>
+        </w:tc>
+      </w:tr>
+      <w:tr>
+        <w:tc>
+          <w:tcPr>
+            <w:tcW w:type="dxa" w:w="2880"/>
+          </w:tcPr>
+          <w:p>
+            <w:r>
+              <w:t>**Cache**</w:t>
+            </w:r>
+          </w:p>
+        </w:tc>
+        <w:tc>
+          <w:tcPr>
+            <w:tcW w:type="dxa" w:w="2880"/>
+          </w:tcPr>
+          <w:p>
+            <w:r>
+              <w:t>Non (MVP)</w:t>
+            </w:r>
+          </w:p>
+        </w:tc>
+        <w:tc>
+          <w:tcPr>
+            <w:tcW w:type="dxa" w:w="2880"/>
+          </w:tcPr>
+          <w:p>
+            <w:r>
+              <w:t>Peut être ajouté plus tard si besoin</w:t>
+            </w:r>
+          </w:p>
+        </w:tc>
+      </w:tr>
+    </w:tbl>
+    <w:p>
+      <w:r>
+        <w:t>Variables d'environnement à ajouter :</w:t>
+      </w:r>
+    </w:p>
+    <w:p>
+      <w:r>
+        <w:t>Exemple de prompt template :</w:t>
+      </w:r>
+    </w:p>
+    <w:p>
+      <w:r>
+        <w:t>Garde-fous :</w:t>
+      </w:r>
+    </w:p>
+    <w:p>
+      <w:pPr>
+        <w:pStyle w:val="ListBullet"/>
+      </w:pPr>
+      <w:r>
+        <w:t>✅ L'IA ne crée jamais directement en base de données</w:t>
+      </w:r>
+    </w:p>
+    <w:p>
+      <w:pPr>
+        <w:pStyle w:val="ListBullet"/>
+      </w:pPr>
+      <w:r>
+        <w:t>✅ L'utilisateur peut éditer tous les champs générés</w:t>
+      </w:r>
+    </w:p>
+    <w:p>
+      <w:pPr>
+        <w:pStyle w:val="ListBullet"/>
+      </w:pPr>
+      <w:r>
+        <w:t>✅ Bouton désactivé si pas de média sélectionné</w:t>
+      </w:r>
+    </w:p>
+    <w:p>
+      <w:pPr>
+        <w:pStyle w:val="ListBullet"/>
+      </w:pPr>
+      <w:r>
+        <w:t>✅ Feature flag : peut être désactivée via `AI_ENABLED=false`</w:t>
+      </w:r>
+    </w:p>
+    <w:p>
+      <w:pPr>
+        <w:pStyle w:val="ListBullet"/>
+      </w:pPr>
+      <w:r>
+        <w:t>✅ Aucun impact sur le schéma de BDD</w:t>
+      </w:r>
+    </w:p>
+    <w:p>
+      <w:r>
+        <w:t>Installation de la dépendance :</w:t>
+      </w:r>
+    </w:p>
+    <w:p>
+      <w:r>
+        <w:t>──────────────────────────────────────────────────</w:t>
+      </w:r>
+    </w:p>
     <w:p>
       <w:r>
         <w:t>Critères de validation Sprint 2 :</w:t>

</xml_diff>